<commit_message>
Add final evidence screenshots and updated report
</commit_message>
<xml_diff>
--- a/AttendX_Practical_Report.docx
+++ b/AttendX_Practical_Report.docx
@@ -2725,7 +2725,7 @@
                 <w:rFonts w:ascii="Consolas" w:hAnsi="Consolas"/>
                 <w:sz w:val="16"/>
               </w:rPr>
-              <w:t>Commit 'Document the shared Git workflow' (40c07e4) created on GitHub; see evidence E07</w:t>
+              <w:t>Commit 'Document the shared Git workflow' (40c07e4) created on GitHub; see evidence E04</w:t>
             </w:r>
           </w:p>
         </w:tc>
@@ -3690,7 +3690,7 @@
               <w:rPr>
                 <w:sz w:val="16"/>
               </w:rPr>
-              <w:t>(see git log)</w:t>
+              <w:t>16de81f</w:t>
             </w:r>
           </w:p>
         </w:tc>
@@ -3705,7 +3705,7 @@
                 <w:rFonts w:ascii="Consolas" w:hAnsi="Consolas"/>
                 <w:sz w:val="16"/>
               </w:rPr>
-              <w:t>Add observation log, evidence index and report</w:t>
+              <w:t>Add observation log, evidence index and practical report</w:t>
             </w:r>
           </w:p>
         </w:tc>
@@ -3734,7 +3734,7 @@
                 <w:rFonts w:ascii="Consolas" w:hAnsi="Consolas"/>
                 <w:sz w:val="16"/>
               </w:rPr>
-              <w:t xml:space="preserve">OBSERVATION_LOG.md, evidence/ </w:t>
+              <w:t>OBSERVATION_LOG.md, README-edit screenshot + evidence index, report .docx (+127)</w:t>
             </w:r>
           </w:p>
         </w:tc>
@@ -3748,7 +3748,81 @@
               <w:rPr>
                 <w:sz w:val="16"/>
               </w:rPr>
-              <w:t>Practical record files. Its hash is shown by git log (it cannot name itself).</w:t>
+              <w:t>Practical record files, pushed to GitHub.</w:t>
+            </w:r>
+          </w:p>
+        </w:tc>
+      </w:tr>
+      <w:tr>
+        <w:tc>
+          <w:tcPr>
+            <w:tcW w:type="dxa" w:w="1152"/>
+          </w:tcPr>
+          <w:p>
+            <w:r/>
+            <w:r>
+              <w:rPr>
+                <w:sz w:val="16"/>
+              </w:rPr>
+              <w:t>(see git log)</w:t>
+            </w:r>
+          </w:p>
+        </w:tc>
+        <w:tc>
+          <w:tcPr>
+            <w:tcW w:type="dxa" w:w="2160"/>
+          </w:tcPr>
+          <w:p>
+            <w:r/>
+            <w:r>
+              <w:rPr>
+                <w:rFonts w:ascii="Consolas" w:hAnsi="Consolas"/>
+                <w:sz w:val="16"/>
+              </w:rPr>
+              <w:t>Add final evidence screenshots and updated report</w:t>
+            </w:r>
+          </w:p>
+        </w:tc>
+        <w:tc>
+          <w:tcPr>
+            <w:tcW w:type="dxa" w:w="1872"/>
+          </w:tcPr>
+          <w:p>
+            <w:r/>
+            <w:r>
+              <w:rPr>
+                <w:sz w:val="16"/>
+              </w:rPr>
+              <w:t>Henil Patel &lt;patelhenil0109@gmail.com&gt;</w:t>
+            </w:r>
+          </w:p>
+        </w:tc>
+        <w:tc>
+          <w:tcPr>
+            <w:tcW w:type="dxa" w:w="2016"/>
+          </w:tcPr>
+          <w:p>
+            <w:r/>
+            <w:r>
+              <w:rPr>
+                <w:rFonts w:ascii="Consolas" w:hAnsi="Consolas"/>
+                <w:sz w:val="16"/>
+              </w:rPr>
+              <w:t>evidence/ screenshots, OBSERVATION_LOG.md, report .docx</w:t>
+            </w:r>
+          </w:p>
+        </w:tc>
+        <w:tc>
+          <w:tcPr>
+            <w:tcW w:type="dxa" w:w="2736"/>
+          </w:tcPr>
+          <w:p>
+            <w:r/>
+            <w:r>
+              <w:rPr>
+                <w:sz w:val="16"/>
+              </w:rPr>
+              <w:t>Final record commit; its own hash can be read from git log (a commit cannot name itself).</w:t>
             </w:r>
           </w:p>
         </w:tc>
@@ -3765,9 +3839,11 @@
           <w:rFonts w:ascii="Consolas" w:hAnsi="Consolas"/>
           <w:sz w:val="18"/>
         </w:rPr>
-        <w:t>00227d9 (HEAD -&gt; main) Add GitHub repository URL to README</w:t>
+        <w:t>16de81f (HEAD -&gt; main, origin/main) Add observation log, evidence index and practical report</w:t>
         <w:br/>
-        <w:t>40c07e4 (origin/main) Document the shared Git workflow</w:t>
+        <w:t>00227d9 Add GitHub repository URL to README</w:t>
+        <w:br/>
+        <w:t>40c07e4 Document the shared Git workflow</w:t>
         <w:br/>
         <w:t>078a96e Add empty-credential login validation</w:t>
         <w:br/>
@@ -3833,12 +3909,12 @@
     </w:p>
     <w:p>
       <w:r>
-        <w:t>[x] Commit history - git log output in section 4/5</w:t>
+        <w:t>[x] Commit history - git log output in sections 5 and 6</w:t>
       </w:r>
     </w:p>
     <w:p>
       <w:r>
-        <w:t>[ ] Evidence screenshots - Only files that exist in evidence/ are listed below</w:t>
+        <w:t>[x] Evidence screenshots - 5 genuine screenshots (E01-E05) in evidence/; other steps are evidenced by the real command outputs in section 5</w:t>
       </w:r>
     </w:p>
     <w:p>
@@ -3859,116 +3935,14 @@
         <w:pStyle w:val="Heading3"/>
       </w:pPr>
       <w:r>
-        <w:t>E01: Git version and identity (git --version, git config)</w:t>
-      </w:r>
-    </w:p>
-    <w:p>
-      <w:r>
-        <w:rPr>
-          <w:b/>
-          <w:color w:val="C00000"/>
-        </w:rPr>
-        <w:t>[Screenshot not yet captured - expected file evidence/E01_git_setup.png]</w:t>
-      </w:r>
-    </w:p>
-    <w:p>
-      <w:pPr>
-        <w:pStyle w:val="Heading3"/>
-      </w:pPr>
-      <w:r>
-        <w:t>E02: VS Code Explorer showing AttendX-Test-Scripts files</w:t>
-      </w:r>
-    </w:p>
-    <w:p>
-      <w:r>
-        <w:rPr>
-          <w:b/>
-          <w:color w:val="C00000"/>
-        </w:rPr>
-        <w:t>[Screenshot not yet captured - expected file evidence/E02_project_files.png]</w:t>
-      </w:r>
-    </w:p>
-    <w:p>
-      <w:pPr>
-        <w:pStyle w:val="Heading3"/>
-      </w:pPr>
-      <w:r>
-        <w:t>E03: Initial git status with untracked files</w:t>
-      </w:r>
-    </w:p>
-    <w:p>
-      <w:r>
-        <w:rPr>
-          <w:b/>
-          <w:color w:val="C00000"/>
-        </w:rPr>
-        <w:t>[Screenshot not yet captured - expected file evidence/E03_initial_status.png]</w:t>
-      </w:r>
-    </w:p>
-    <w:p>
-      <w:pPr>
-        <w:pStyle w:val="Heading3"/>
-      </w:pPr>
-      <w:r>
-        <w:t>E04: git add, git status, git commit output</w:t>
-      </w:r>
-    </w:p>
-    <w:p>
-      <w:r>
-        <w:rPr>
-          <w:b/>
-          <w:color w:val="C00000"/>
-        </w:rPr>
-        <w:t>[Screenshot not yet captured - expected file evidence/E04_first_commit.png]</w:t>
-      </w:r>
-    </w:p>
-    <w:p>
-      <w:pPr>
-        <w:pStyle w:val="Heading3"/>
-      </w:pPr>
-      <w:r>
-        <w:t>E05: Push output and GitHub page showing the three files</w:t>
-      </w:r>
-    </w:p>
-    <w:p>
-      <w:r>
-        <w:rPr>
-          <w:b/>
-          <w:color w:val="C00000"/>
-        </w:rPr>
-        <w:t>[Screenshot not yet captured - expected file evidence/E05_github_push.png]</w:t>
-      </w:r>
-    </w:p>
-    <w:p>
-      <w:pPr>
-        <w:pStyle w:val="Heading3"/>
-      </w:pPr>
-      <w:r>
-        <w:t>E06: Second commit and push output</w:t>
-      </w:r>
-    </w:p>
-    <w:p>
-      <w:r>
-        <w:rPr>
-          <w:b/>
-          <w:color w:val="C00000"/>
-        </w:rPr>
-        <w:t>[Screenshot not yet captured - expected file evidence/E06_second_commit_push.png]</w:t>
-      </w:r>
-    </w:p>
-    <w:p>
-      <w:pPr>
-        <w:pStyle w:val="Heading3"/>
-      </w:pPr>
-      <w:r>
-        <w:t>E07: README on GitHub showing the added Version Control Workflow section</w:t>
+        <w:t>E01: Git identity configured for this repository (git config --local --get-regexp "^user\.")</w:t>
       </w:r>
     </w:p>
     <w:p>
       <w:r>
         <w:drawing>
           <wp:inline xmlns:a="http://schemas.openxmlformats.org/drawingml/2006/main" xmlns:pic="http://schemas.openxmlformats.org/drawingml/2006/picture">
-            <wp:extent cx="5760720" cy="2818107"/>
+            <wp:extent cx="5760720" cy="317805"/>
             <wp:docPr id="1" name="Picture 1"/>
             <wp:cNvGraphicFramePr>
               <a:graphicFrameLocks noChangeAspect="1"/>
@@ -3977,11 +3951,167 @@
               <a:graphicData uri="http://schemas.openxmlformats.org/drawingml/2006/picture">
                 <pic:pic>
                   <pic:nvPicPr>
-                    <pic:cNvPr id="0" name="E07_github_readme_edit.png"/>
+                    <pic:cNvPr id="0" name="E01_git_setup.png"/>
                     <pic:cNvPicPr/>
                   </pic:nvPicPr>
                   <pic:blipFill>
                     <a:blip r:embed="rId9"/>
+                    <a:stretch>
+                      <a:fillRect/>
+                    </a:stretch>
+                  </pic:blipFill>
+                  <pic:spPr>
+                    <a:xfrm>
+                      <a:off x="0" y="0"/>
+                      <a:ext cx="5760720" cy="317805"/>
+                    </a:xfrm>
+                    <a:prstGeom prst="rect"/>
+                  </pic:spPr>
+                </pic:pic>
+              </a:graphicData>
+            </a:graphic>
+          </wp:inline>
+        </w:drawing>
+      </w:r>
+    </w:p>
+    <w:p>
+      <w:r>
+        <w:rPr>
+          <w:i/>
+        </w:rPr>
+        <w:t>File: evidence/E01_git_setup.png</w:t>
+      </w:r>
+    </w:p>
+    <w:p>
+      <w:pPr>
+        <w:pStyle w:val="Heading3"/>
+      </w:pPr>
+      <w:r>
+        <w:t>E02: GitHub repository page after the pushes: main branch, 5 commits, all project files present</w:t>
+      </w:r>
+    </w:p>
+    <w:p>
+      <w:r>
+        <w:drawing>
+          <wp:inline xmlns:a="http://schemas.openxmlformats.org/drawingml/2006/main" xmlns:pic="http://schemas.openxmlformats.org/drawingml/2006/picture">
+            <wp:extent cx="5760720" cy="2644164"/>
+            <wp:docPr id="2" name="Picture 2"/>
+            <wp:cNvGraphicFramePr>
+              <a:graphicFrameLocks noChangeAspect="1"/>
+            </wp:cNvGraphicFramePr>
+            <a:graphic>
+              <a:graphicData uri="http://schemas.openxmlformats.org/drawingml/2006/picture">
+                <pic:pic>
+                  <pic:nvPicPr>
+                    <pic:cNvPr id="0" name="E02_github_push.png"/>
+                    <pic:cNvPicPr/>
+                  </pic:nvPicPr>
+                  <pic:blipFill>
+                    <a:blip r:embed="rId10"/>
+                    <a:stretch>
+                      <a:fillRect/>
+                    </a:stretch>
+                  </pic:blipFill>
+                  <pic:spPr>
+                    <a:xfrm>
+                      <a:off x="0" y="0"/>
+                      <a:ext cx="5760720" cy="2644164"/>
+                    </a:xfrm>
+                    <a:prstGeom prst="rect"/>
+                  </pic:spPr>
+                </pic:pic>
+              </a:graphicData>
+            </a:graphic>
+          </wp:inline>
+        </w:drawing>
+      </w:r>
+    </w:p>
+    <w:p>
+      <w:r>
+        <w:rPr>
+          <w:i/>
+        </w:rPr>
+        <w:t>File: evidence/E02_github_push.png</w:t>
+      </w:r>
+    </w:p>
+    <w:p>
+      <w:pPr>
+        <w:pStyle w:val="Heading3"/>
+      </w:pPr>
+      <w:r>
+        <w:t>E03: GitHub commit history: all 5 commits, including the direct GitHub edit (Verified)</w:t>
+      </w:r>
+    </w:p>
+    <w:p>
+      <w:r>
+        <w:drawing>
+          <wp:inline xmlns:a="http://schemas.openxmlformats.org/drawingml/2006/main" xmlns:pic="http://schemas.openxmlformats.org/drawingml/2006/picture">
+            <wp:extent cx="5760720" cy="2554136"/>
+            <wp:docPr id="3" name="Picture 3"/>
+            <wp:cNvGraphicFramePr>
+              <a:graphicFrameLocks noChangeAspect="1"/>
+            </wp:cNvGraphicFramePr>
+            <a:graphic>
+              <a:graphicData uri="http://schemas.openxmlformats.org/drawingml/2006/picture">
+                <pic:pic>
+                  <pic:nvPicPr>
+                    <pic:cNvPr id="0" name="E03_github_commits.png"/>
+                    <pic:cNvPicPr/>
+                  </pic:nvPicPr>
+                  <pic:blipFill>
+                    <a:blip r:embed="rId11"/>
+                    <a:stretch>
+                      <a:fillRect/>
+                    </a:stretch>
+                  </pic:blipFill>
+                  <pic:spPr>
+                    <a:xfrm>
+                      <a:off x="0" y="0"/>
+                      <a:ext cx="5760720" cy="2554136"/>
+                    </a:xfrm>
+                    <a:prstGeom prst="rect"/>
+                  </pic:spPr>
+                </pic:pic>
+              </a:graphicData>
+            </a:graphic>
+          </wp:inline>
+        </w:drawing>
+      </w:r>
+    </w:p>
+    <w:p>
+      <w:r>
+        <w:rPr>
+          <w:i/>
+        </w:rPr>
+        <w:t>File: evidence/E03_github_commits.png</w:t>
+      </w:r>
+    </w:p>
+    <w:p>
+      <w:pPr>
+        <w:pStyle w:val="Heading3"/>
+      </w:pPr>
+      <w:r>
+        <w:t>E04: README.md on GitHub showing the Version Control Workflow section added through the GitHub web editor</w:t>
+      </w:r>
+    </w:p>
+    <w:p>
+      <w:r>
+        <w:drawing>
+          <wp:inline xmlns:a="http://schemas.openxmlformats.org/drawingml/2006/main" xmlns:pic="http://schemas.openxmlformats.org/drawingml/2006/picture">
+            <wp:extent cx="5760720" cy="2818107"/>
+            <wp:docPr id="4" name="Picture 4"/>
+            <wp:cNvGraphicFramePr>
+              <a:graphicFrameLocks noChangeAspect="1"/>
+            </wp:cNvGraphicFramePr>
+            <a:graphic>
+              <a:graphicData uri="http://schemas.openxmlformats.org/drawingml/2006/picture">
+                <pic:pic>
+                  <pic:nvPicPr>
+                    <pic:cNvPr id="0" name="E04_github_readme_edit.png"/>
+                    <pic:cNvPicPr/>
+                  </pic:nvPicPr>
+                  <pic:blipFill>
+                    <a:blip r:embed="rId12"/>
                     <a:stretch>
                       <a:fillRect/>
                     </a:stretch>
@@ -4005,7 +4135,7 @@
         <w:rPr>
           <w:i/>
         </w:rPr>
-        <w:t>File: evidence/E07_github_readme_edit.png</w:t>
+        <w:t>File: evidence/E04_github_readme_edit.png</w:t>
       </w:r>
     </w:p>
     <w:p>
@@ -4013,50 +4143,59 @@
         <w:pStyle w:val="Heading3"/>
       </w:pPr>
       <w:r>
-        <w:t>E08: git pull --ff-only output</w:t>
+        <w:t>E05: Both automation scripts passing in the VS Code terminal (4 login tests, 5 attendance tests)</w:t>
+      </w:r>
+    </w:p>
+    <w:p>
+      <w:r>
+        <w:drawing>
+          <wp:inline xmlns:a="http://schemas.openxmlformats.org/drawingml/2006/main" xmlns:pic="http://schemas.openxmlformats.org/drawingml/2006/picture">
+            <wp:extent cx="5760720" cy="1909648"/>
+            <wp:docPr id="5" name="Picture 5"/>
+            <wp:cNvGraphicFramePr>
+              <a:graphicFrameLocks noChangeAspect="1"/>
+            </wp:cNvGraphicFramePr>
+            <a:graphic>
+              <a:graphicData uri="http://schemas.openxmlformats.org/drawingml/2006/picture">
+                <pic:pic>
+                  <pic:nvPicPr>
+                    <pic:cNvPr id="0" name="E05_test_results.png"/>
+                    <pic:cNvPicPr/>
+                  </pic:nvPicPr>
+                  <pic:blipFill>
+                    <a:blip r:embed="rId13"/>
+                    <a:stretch>
+                      <a:fillRect/>
+                    </a:stretch>
+                  </pic:blipFill>
+                  <pic:spPr>
+                    <a:xfrm>
+                      <a:off x="0" y="0"/>
+                      <a:ext cx="5760720" cy="1909648"/>
+                    </a:xfrm>
+                    <a:prstGeom prst="rect"/>
+                  </pic:spPr>
+                </pic:pic>
+              </a:graphicData>
+            </a:graphic>
+          </wp:inline>
+        </w:drawing>
       </w:r>
     </w:p>
     <w:p>
       <w:r>
         <w:rPr>
-          <w:b/>
-          <w:color w:val="C00000"/>
+          <w:i/>
         </w:rPr>
-        <w:t>[Screenshot not yet captured - expected file evidence/E08_git_pull.png]</w:t>
-      </w:r>
-    </w:p>
-    <w:p>
-      <w:pPr>
-        <w:pStyle w:val="Heading3"/>
-      </w:pPr>
-      <w:r>
-        <w:t>E09: git log --oneline --decorate</w:t>
+        <w:t>File: evidence/E05_test_results.png</w:t>
       </w:r>
     </w:p>
     <w:p>
       <w:r>
         <w:rPr>
-          <w:b/>
-          <w:color w:val="C00000"/>
+          <w:i/>
         </w:rPr>
-        <w:t>[Screenshot not yet captured - expected file evidence/E09_git_log.png]</w:t>
-      </w:r>
-    </w:p>
-    <w:p>
-      <w:pPr>
-        <w:pStyle w:val="Heading3"/>
-      </w:pPr>
-      <w:r>
-        <w:t>E10: Both test scripts passing</w:t>
-      </w:r>
-    </w:p>
-    <w:p>
-      <w:r>
-        <w:rPr>
-          <w:b/>
-          <w:color w:val="C00000"/>
-        </w:rPr>
-        <w:t>[Screenshot not yet captured - expected file evidence/E10_test_results.png]</w:t>
+        <w:t>Steps without a screenshot (initial git status, staging and first commit, git pull, git log, project file listing) were executed as shown in the command observation table (section 5) and the final git log in section 6; their outputs are copied from the real terminal, not recreated as images.</w:t>
       </w:r>
     </w:p>
     <w:sectPr>

</xml_diff>